<commit_message>
Updated report to add author's name
</commit_message>
<xml_diff>
--- a/melanoma-statistical-analysis-report.docx
+++ b/melanoma-statistical-analysis-report.docx
@@ -1,65 +1,91 @@
 
 <file path=word/document.xml><?xml version="1.0" encoding="utf-8"?>
-<w:document xmlns:wpc="http://schemas.microsoft.com/office/word/2010/wordprocessingCanvas" xmlns:cx="http://schemas.microsoft.com/office/drawing/2014/chartex" xmlns:cx1="http://schemas.microsoft.com/office/drawing/2015/9/8/chartex" xmlns:cx2="http://schemas.microsoft.com/office/drawing/2015/10/21/chartex" xmlns:cx3="http://schemas.microsoft.com/office/drawing/2016/5/9/chartex" xmlns:cx4="http://schemas.microsoft.com/office/drawing/2016/5/10/chartex" xmlns:cx5="http://schemas.microsoft.com/office/drawing/2016/5/11/chartex" xmlns:cx6="http://schemas.microsoft.com/office/drawing/2016/5/12/chartex" xmlns:cx7="http://schemas.microsoft.com/office/drawing/2016/5/13/chartex" xmlns:cx8="http://schemas.microsoft.com/office/drawing/2016/5/14/chartex" xmlns:mc="http://schemas.openxmlformats.org/markup-compatibility/2006" xmlns:aink="http://schemas.microsoft.com/office/drawing/2016/ink" xmlns:am3d="http://schemas.microsoft.com/office/drawing/2017/model3d" xmlns:o="urn:schemas-microsoft-com:office:office" xmlns:oel="http://schemas.microsoft.com/office/2019/extlst" xmlns:r="http://schemas.openxmlformats.org/officeDocument/2006/relationships" xmlns:m="http://schemas.openxmlformats.org/officeDocument/2006/math" xmlns:v="urn:schemas-microsoft-com:vml" xmlns:wp14="http://schemas.microsoft.com/office/word/2010/wordprocessingDrawing" xmlns:wp="http://schemas.openxmlformats.org/drawingml/2006/wordprocessingDrawing" xmlns:w10="urn:schemas-microsoft-com:office:word" xmlns:w="http://schemas.openxmlformats.org/wordprocessingml/2006/main" xmlns:w14="http://schemas.microsoft.com/office/word/2010/wordml" xmlns:w15="http://schemas.microsoft.com/office/word/2012/wordml" xmlns:w16cex="http://schemas.microsoft.com/office/word/2018/wordml/cex" xmlns:w16cid="http://schemas.microsoft.com/office/word/2016/wordml/cid" xmlns:w16="http://schemas.microsoft.com/office/word/2018/wordml" xmlns:w16sdtdh="http://schemas.microsoft.com/office/word/2020/wordml/sdtdatahash" xmlns:w16se="http://schemas.microsoft.com/office/word/2015/wordml/symex" xmlns:wpg="http://schemas.microsoft.com/office/word/2010/wordprocessingGroup" xmlns:wpi="http://schemas.microsoft.com/office/word/2010/wordprocessingInk" xmlns:wne="http://schemas.microsoft.com/office/word/2006/wordml" xmlns:wps="http://schemas.microsoft.com/office/word/2010/wordprocessingShape" mc:Ignorable="w14 w15 w16se w16cid w16 w16cex w16sdtdh wp14">
+<w:document xmlns:wpc="http://schemas.microsoft.com/office/word/2010/wordprocessingCanvas" xmlns:cx="http://schemas.microsoft.com/office/drawing/2014/chartex" xmlns:cx1="http://schemas.microsoft.com/office/drawing/2015/9/8/chartex" xmlns:cx2="http://schemas.microsoft.com/office/drawing/2015/10/21/chartex" xmlns:cx3="http://schemas.microsoft.com/office/drawing/2016/5/9/chartex" xmlns:cx4="http://schemas.microsoft.com/office/drawing/2016/5/10/chartex" xmlns:cx5="http://schemas.microsoft.com/office/drawing/2016/5/11/chartex" xmlns:cx6="http://schemas.microsoft.com/office/drawing/2016/5/12/chartex" xmlns:cx7="http://schemas.microsoft.com/office/drawing/2016/5/13/chartex" xmlns:cx8="http://schemas.microsoft.com/office/drawing/2016/5/14/chartex" xmlns:mc="http://schemas.openxmlformats.org/markup-compatibility/2006" xmlns:aink="http://schemas.microsoft.com/office/drawing/2016/ink" xmlns:am3d="http://schemas.microsoft.com/office/drawing/2017/model3d" xmlns:o="urn:schemas-microsoft-com:office:office" xmlns:oel="http://schemas.microsoft.com/office/2019/extlst" xmlns:r="http://schemas.openxmlformats.org/officeDocument/2006/relationships" xmlns:m="http://schemas.openxmlformats.org/officeDocument/2006/math" xmlns:v="urn:schemas-microsoft-com:vml" xmlns:wp14="http://schemas.microsoft.com/office/word/2010/wordprocessingDrawing" xmlns:wp="http://schemas.openxmlformats.org/drawingml/2006/wordprocessingDrawing" xmlns:w10="urn:schemas-microsoft-com:office:word" xmlns:w="http://schemas.openxmlformats.org/wordprocessingml/2006/main" xmlns:w14="http://schemas.microsoft.com/office/word/2010/wordml" xmlns:w15="http://schemas.microsoft.com/office/word/2012/wordml" xmlns:w16cex="http://schemas.microsoft.com/office/word/2018/wordml/cex" xmlns:w16cid="http://schemas.microsoft.com/office/word/2016/wordml/cid" xmlns:w16="http://schemas.microsoft.com/office/word/2018/wordml" xmlns:w16du="http://schemas.microsoft.com/office/word/2023/wordml/word16du" xmlns:w16sdtdh="http://schemas.microsoft.com/office/word/2020/wordml/sdtdatahash" xmlns:w16sdtfl="http://schemas.microsoft.com/office/word/2024/wordml/sdtformatlock" xmlns:w16se="http://schemas.microsoft.com/office/word/2015/wordml/symex" xmlns:wpg="http://schemas.microsoft.com/office/word/2010/wordprocessingGroup" xmlns:wpi="http://schemas.microsoft.com/office/word/2010/wordprocessingInk" xmlns:wne="http://schemas.microsoft.com/office/word/2006/wordml" xmlns:wps="http://schemas.microsoft.com/office/word/2010/wordprocessingShape" mc:Ignorable="w14 w15 w16se w16cid w16 w16cex w16sdtdh w16sdtfl w16du wp14">
   <w:body>
     <w:p>
       <w:pPr>
-        <w:spacing w:line="360" w:lineRule="auto"/>
-        <w:jc w:val="center"/>
-        <w:rPr>
+        <w:rPr>
+          <w:rStyle w:val="SubtleReference"/>
           <w:rFonts w:asciiTheme="majorHAnsi" w:hAnsiTheme="majorHAnsi" w:cstheme="majorHAnsi"/>
-          <w:b/>
-          <w:bCs/>
-        </w:rPr>
-      </w:pPr>
-      <w:r>
-        <w:rPr>
+        </w:rPr>
+      </w:pPr>
+      <w:r>
+        <w:rPr>
+          <w:rStyle w:val="SubtleReference"/>
           <w:rFonts w:asciiTheme="majorHAnsi" w:hAnsiTheme="majorHAnsi" w:cstheme="majorHAnsi"/>
-          <w:b/>
-          <w:bCs/>
-        </w:rPr>
-        <w:t>EXPLORATORY DATA ANALYSIS OF THE MELANOMA DATASET IN R</w:t>
-      </w:r>
-    </w:p>
-    <w:p>
-      <w:pPr>
-        <w:spacing w:line="360" w:lineRule="auto"/>
-        <w:jc w:val="center"/>
-        <w:rPr>
+        </w:rPr>
+        <w:t>Melanoma Survival Analysis Using Statistical Modelling</w:t>
+      </w:r>
+    </w:p>
+    <w:p>
+      <w:pPr>
+        <w:rPr>
+          <w:rStyle w:val="SubtleReference"/>
           <w:rFonts w:asciiTheme="majorHAnsi" w:hAnsiTheme="majorHAnsi" w:cstheme="majorHAnsi"/>
-          <w:b/>
-          <w:bCs/>
-        </w:rPr>
-      </w:pPr>
-      <w:r>
-        <w:rPr>
+        </w:rPr>
+      </w:pPr>
+    </w:p>
+    <w:p>
+      <w:pPr>
+        <w:rPr>
+          <w:rStyle w:val="SubtleReference"/>
           <w:rFonts w:asciiTheme="majorHAnsi" w:hAnsiTheme="majorHAnsi" w:cstheme="majorHAnsi"/>
-          <w:b/>
-          <w:bCs/>
-        </w:rPr>
-        <w:t>BENJAMIN BOGWAM PHILIP</w:t>
-      </w:r>
-    </w:p>
-    <w:p>
-      <w:pPr>
-        <w:spacing w:line="360" w:lineRule="auto"/>
-        <w:jc w:val="center"/>
-        <w:rPr>
+        </w:rPr>
+      </w:pPr>
+      <w:r>
+        <w:rPr>
+          <w:rStyle w:val="SubtleReference"/>
           <w:rFonts w:asciiTheme="majorHAnsi" w:hAnsiTheme="majorHAnsi" w:cstheme="majorHAnsi"/>
-          <w:b/>
-          <w:bCs/>
-        </w:rPr>
-      </w:pPr>
-      <w:r>
-        <w:rPr>
+        </w:rPr>
+        <w:t xml:space="preserve">Author: Benjamin Philip  </w:t>
+      </w:r>
+    </w:p>
+    <w:p>
+      <w:pPr>
+        <w:rPr>
+          <w:rStyle w:val="SubtleReference"/>
           <w:rFonts w:asciiTheme="majorHAnsi" w:hAnsiTheme="majorHAnsi" w:cstheme="majorHAnsi"/>
-          <w:b/>
-          <w:bCs/>
-        </w:rPr>
-        <w:t>7CS039/UM1: STATISTICS FOR DATA SCIENCE</w:t>
-      </w:r>
-    </w:p>
-    <w:p/>
+        </w:rPr>
+      </w:pPr>
+      <w:r>
+        <w:rPr>
+          <w:rStyle w:val="SubtleReference"/>
+          <w:rFonts w:asciiTheme="majorHAnsi" w:hAnsiTheme="majorHAnsi" w:cstheme="majorHAnsi"/>
+        </w:rPr>
+        <w:t xml:space="preserve">Tools: R, ggplot2, </w:t>
+      </w:r>
+      <w:proofErr w:type="spellStart"/>
+      <w:r>
+        <w:rPr>
+          <w:rStyle w:val="SubtleReference"/>
+          <w:rFonts w:asciiTheme="majorHAnsi" w:hAnsiTheme="majorHAnsi" w:cstheme="majorHAnsi"/>
+        </w:rPr>
+        <w:t>dplyr</w:t>
+      </w:r>
+      <w:proofErr w:type="spellEnd"/>
+      <w:r>
+        <w:rPr>
+          <w:rStyle w:val="SubtleReference"/>
+          <w:rFonts w:asciiTheme="majorHAnsi" w:hAnsiTheme="majorHAnsi" w:cstheme="majorHAnsi"/>
+        </w:rPr>
+        <w:t xml:space="preserve">  </w:t>
+      </w:r>
+    </w:p>
+    <w:p>
+      <w:pPr>
+        <w:rPr>
+          <w:rStyle w:val="SubtleReference"/>
+          <w:rFonts w:asciiTheme="minorHAnsi" w:hAnsiTheme="minorHAnsi" w:cstheme="minorHAnsi"/>
+        </w:rPr>
+      </w:pPr>
+      <w:r>
+        <w:rPr>
+          <w:rStyle w:val="SubtleReference"/>
+          <w:rFonts w:asciiTheme="majorHAnsi" w:hAnsiTheme="majorHAnsi" w:cstheme="majorHAnsi"/>
+        </w:rPr>
+        <w:t>Project Type: Statistical Analysis</w:t>
+      </w:r>
+    </w:p>
     <w:p/>
     <w:p>
       <w:pPr>
@@ -3628,7 +3654,7 @@
           <w14:ligatures w14:val="standardContextual"/>
         </w:rPr>
         <w:drawing>
-          <wp:anchor distT="0" distB="0" distL="114300" distR="114300" simplePos="0" relativeHeight="251685888" behindDoc="0" locked="0" layoutInCell="1" allowOverlap="1" wp14:anchorId="351FC725" wp14:editId="590BFC5C">
+          <wp:anchor distT="0" distB="0" distL="114300" distR="114300" simplePos="0" relativeHeight="251685888" behindDoc="0" locked="0" layoutInCell="1" allowOverlap="1" wp14:anchorId="351FC725" wp14:editId="45605D1B">
             <wp:simplePos x="0" y="0"/>
             <wp:positionH relativeFrom="column">
               <wp:posOffset>883173</wp:posOffset>
@@ -4169,7 +4195,7 @@
           <w14:ligatures w14:val="standardContextual"/>
         </w:rPr>
         <w:drawing>
-          <wp:anchor distT="0" distB="0" distL="114300" distR="114300" simplePos="0" relativeHeight="251687936" behindDoc="0" locked="0" layoutInCell="1" allowOverlap="1" wp14:anchorId="4D8FAB66" wp14:editId="651604A0">
+          <wp:anchor distT="0" distB="0" distL="114300" distR="114300" simplePos="0" relativeHeight="251687936" behindDoc="0" locked="0" layoutInCell="1" allowOverlap="1" wp14:anchorId="4D8FAB66" wp14:editId="75A49120">
             <wp:simplePos x="0" y="0"/>
             <wp:positionH relativeFrom="margin">
               <wp:posOffset>806450</wp:posOffset>
@@ -5643,7 +5669,7 @@
           <w14:ligatures w14:val="standardContextual"/>
         </w:rPr>
         <w:drawing>
-          <wp:anchor distT="0" distB="0" distL="114300" distR="114300" simplePos="0" relativeHeight="251675648" behindDoc="0" locked="0" layoutInCell="1" allowOverlap="1" wp14:anchorId="3154EE3E" wp14:editId="3F9C2A78">
+          <wp:anchor distT="0" distB="0" distL="114300" distR="114300" simplePos="0" relativeHeight="251675648" behindDoc="0" locked="0" layoutInCell="1" allowOverlap="1" wp14:anchorId="3154EE3E" wp14:editId="68B4A82C">
             <wp:simplePos x="0" y="0"/>
             <wp:positionH relativeFrom="margin">
               <wp:posOffset>775970</wp:posOffset>
@@ -8902,17 +8928,8 @@
           <w:rFonts w:asciiTheme="minorHAnsi" w:hAnsiTheme="minorHAnsi" w:cstheme="minorHAnsi"/>
           <w:lang w:val="en-US"/>
         </w:rPr>
-        <w:t xml:space="preserve">for both </w:t>
-      </w:r>
-      <w:proofErr w:type="gramStart"/>
-      <w:r>
-        <w:rPr>
-          <w:rFonts w:asciiTheme="minorHAnsi" w:hAnsiTheme="minorHAnsi" w:cstheme="minorHAnsi"/>
-          <w:lang w:val="en-US"/>
-        </w:rPr>
-        <w:t>gender</w:t>
-      </w:r>
-      <w:proofErr w:type="gramEnd"/>
+        <w:t>for both gender</w:t>
+      </w:r>
       <w:r>
         <w:rPr>
           <w:rFonts w:asciiTheme="minorHAnsi" w:hAnsiTheme="minorHAnsi" w:cstheme="minorHAnsi"/>
@@ -9586,7 +9603,7 @@
 </file>
 
 <file path=word/numbering.xml><?xml version="1.0" encoding="utf-8"?>
-<w:numbering xmlns:wpc="http://schemas.microsoft.com/office/word/2010/wordprocessingCanvas" xmlns:cx="http://schemas.microsoft.com/office/drawing/2014/chartex" xmlns:cx1="http://schemas.microsoft.com/office/drawing/2015/9/8/chartex" xmlns:cx2="http://schemas.microsoft.com/office/drawing/2015/10/21/chartex" xmlns:cx3="http://schemas.microsoft.com/office/drawing/2016/5/9/chartex" xmlns:cx4="http://schemas.microsoft.com/office/drawing/2016/5/10/chartex" xmlns:cx5="http://schemas.microsoft.com/office/drawing/2016/5/11/chartex" xmlns:cx6="http://schemas.microsoft.com/office/drawing/2016/5/12/chartex" xmlns:cx7="http://schemas.microsoft.com/office/drawing/2016/5/13/chartex" xmlns:cx8="http://schemas.microsoft.com/office/drawing/2016/5/14/chartex" xmlns:mc="http://schemas.openxmlformats.org/markup-compatibility/2006" xmlns:aink="http://schemas.microsoft.com/office/drawing/2016/ink" xmlns:am3d="http://schemas.microsoft.com/office/drawing/2017/model3d" xmlns:o="urn:schemas-microsoft-com:office:office" xmlns:oel="http://schemas.microsoft.com/office/2019/extlst" xmlns:r="http://schemas.openxmlformats.org/officeDocument/2006/relationships" xmlns:m="http://schemas.openxmlformats.org/officeDocument/2006/math" xmlns:v="urn:schemas-microsoft-com:vml" xmlns:wp14="http://schemas.microsoft.com/office/word/2010/wordprocessingDrawing" xmlns:wp="http://schemas.openxmlformats.org/drawingml/2006/wordprocessingDrawing" xmlns:w10="urn:schemas-microsoft-com:office:word" xmlns:w="http://schemas.openxmlformats.org/wordprocessingml/2006/main" xmlns:w14="http://schemas.microsoft.com/office/word/2010/wordml" xmlns:w15="http://schemas.microsoft.com/office/word/2012/wordml" xmlns:w16cex="http://schemas.microsoft.com/office/word/2018/wordml/cex" xmlns:w16cid="http://schemas.microsoft.com/office/word/2016/wordml/cid" xmlns:w16="http://schemas.microsoft.com/office/word/2018/wordml" xmlns:w16sdtdh="http://schemas.microsoft.com/office/word/2020/wordml/sdtdatahash" xmlns:w16se="http://schemas.microsoft.com/office/word/2015/wordml/symex" xmlns:wpg="http://schemas.microsoft.com/office/word/2010/wordprocessingGroup" xmlns:wpi="http://schemas.microsoft.com/office/word/2010/wordprocessingInk" xmlns:wne="http://schemas.microsoft.com/office/word/2006/wordml" xmlns:wps="http://schemas.microsoft.com/office/word/2010/wordprocessingShape" mc:Ignorable="w14 w15 w16se w16cid w16 w16cex w16sdtdh wp14">
+<w:numbering xmlns:wpc="http://schemas.microsoft.com/office/word/2010/wordprocessingCanvas" xmlns:cx="http://schemas.microsoft.com/office/drawing/2014/chartex" xmlns:cx1="http://schemas.microsoft.com/office/drawing/2015/9/8/chartex" xmlns:cx2="http://schemas.microsoft.com/office/drawing/2015/10/21/chartex" xmlns:cx3="http://schemas.microsoft.com/office/drawing/2016/5/9/chartex" xmlns:cx4="http://schemas.microsoft.com/office/drawing/2016/5/10/chartex" xmlns:cx5="http://schemas.microsoft.com/office/drawing/2016/5/11/chartex" xmlns:cx6="http://schemas.microsoft.com/office/drawing/2016/5/12/chartex" xmlns:cx7="http://schemas.microsoft.com/office/drawing/2016/5/13/chartex" xmlns:cx8="http://schemas.microsoft.com/office/drawing/2016/5/14/chartex" xmlns:mc="http://schemas.openxmlformats.org/markup-compatibility/2006" xmlns:aink="http://schemas.microsoft.com/office/drawing/2016/ink" xmlns:am3d="http://schemas.microsoft.com/office/drawing/2017/model3d" xmlns:o="urn:schemas-microsoft-com:office:office" xmlns:oel="http://schemas.microsoft.com/office/2019/extlst" xmlns:r="http://schemas.openxmlformats.org/officeDocument/2006/relationships" xmlns:m="http://schemas.openxmlformats.org/officeDocument/2006/math" xmlns:v="urn:schemas-microsoft-com:vml" xmlns:wp14="http://schemas.microsoft.com/office/word/2010/wordprocessingDrawing" xmlns:wp="http://schemas.openxmlformats.org/drawingml/2006/wordprocessingDrawing" xmlns:w10="urn:schemas-microsoft-com:office:word" xmlns:w="http://schemas.openxmlformats.org/wordprocessingml/2006/main" xmlns:w14="http://schemas.microsoft.com/office/word/2010/wordml" xmlns:w15="http://schemas.microsoft.com/office/word/2012/wordml" xmlns:w16cex="http://schemas.microsoft.com/office/word/2018/wordml/cex" xmlns:w16cid="http://schemas.microsoft.com/office/word/2016/wordml/cid" xmlns:w16="http://schemas.microsoft.com/office/word/2018/wordml" xmlns:w16du="http://schemas.microsoft.com/office/word/2023/wordml/word16du" xmlns:w16sdtdh="http://schemas.microsoft.com/office/word/2020/wordml/sdtdatahash" xmlns:w16sdtfl="http://schemas.microsoft.com/office/word/2024/wordml/sdtformatlock" xmlns:w16se="http://schemas.microsoft.com/office/word/2015/wordml/symex" xmlns:wpg="http://schemas.microsoft.com/office/word/2010/wordprocessingGroup" xmlns:wpi="http://schemas.microsoft.com/office/word/2010/wordprocessingInk" xmlns:wne="http://schemas.microsoft.com/office/word/2006/wordml" xmlns:wps="http://schemas.microsoft.com/office/word/2010/wordprocessingShape" mc:Ignorable="w14 w15 w16se w16cid w16 w16cex w16sdtdh w16sdtfl w16du wp14">
   <w:abstractNum w:abstractNumId="0" w15:restartNumberingAfterBreak="0">
     <w:nsid w:val="02133B16"/>
     <w:multiLevelType w:val="hybridMultilevel"/>
@@ -11551,7 +11568,7 @@
 </file>
 
 <file path=word/styles.xml><?xml version="1.0" encoding="utf-8"?>
-<w:styles xmlns:mc="http://schemas.openxmlformats.org/markup-compatibility/2006" xmlns:r="http://schemas.openxmlformats.org/officeDocument/2006/relationships" xmlns:w="http://schemas.openxmlformats.org/wordprocessingml/2006/main" xmlns:w14="http://schemas.microsoft.com/office/word/2010/wordml" xmlns:w15="http://schemas.microsoft.com/office/word/2012/wordml" xmlns:w16cex="http://schemas.microsoft.com/office/word/2018/wordml/cex" xmlns:w16cid="http://schemas.microsoft.com/office/word/2016/wordml/cid" xmlns:w16="http://schemas.microsoft.com/office/word/2018/wordml" xmlns:w16sdtdh="http://schemas.microsoft.com/office/word/2020/wordml/sdtdatahash" xmlns:w16se="http://schemas.microsoft.com/office/word/2015/wordml/symex" mc:Ignorable="w14 w15 w16se w16cid w16 w16cex w16sdtdh">
+<w:styles xmlns:mc="http://schemas.openxmlformats.org/markup-compatibility/2006" xmlns:r="http://schemas.openxmlformats.org/officeDocument/2006/relationships" xmlns:w="http://schemas.openxmlformats.org/wordprocessingml/2006/main" xmlns:w14="http://schemas.microsoft.com/office/word/2010/wordml" xmlns:w15="http://schemas.microsoft.com/office/word/2012/wordml" xmlns:w16cex="http://schemas.microsoft.com/office/word/2018/wordml/cex" xmlns:w16cid="http://schemas.microsoft.com/office/word/2016/wordml/cid" xmlns:w16="http://schemas.microsoft.com/office/word/2018/wordml" xmlns:w16du="http://schemas.microsoft.com/office/word/2023/wordml/word16du" xmlns:w16sdtdh="http://schemas.microsoft.com/office/word/2020/wordml/sdtdatahash" xmlns:w16sdtfl="http://schemas.microsoft.com/office/word/2024/wordml/sdtformatlock" xmlns:w16se="http://schemas.microsoft.com/office/word/2015/wordml/symex" mc:Ignorable="w14 w15 w16se w16cid w16 w16cex w16sdtdh w16sdtfl w16du">
   <w:docDefaults>
     <w:rPrDefault>
       <w:rPr>
@@ -12192,6 +12209,17 @@
       <w:u w:val="single"/>
     </w:rPr>
   </w:style>
+  <w:style w:type="character" w:styleId="SubtleReference">
+    <w:name w:val="Subtle Reference"/>
+    <w:basedOn w:val="DefaultParagraphFont"/>
+    <w:uiPriority w:val="31"/>
+    <w:qFormat/>
+    <w:rsid w:val="008053D6"/>
+    <w:rPr>
+      <w:smallCaps/>
+      <w:color w:val="5A5A5A" w:themeColor="text1" w:themeTint="A5"/>
+    </w:rPr>
+  </w:style>
 </w:styles>
 </file>
 

</xml_diff>